<commit_message>
Adding Laravel Notes For Indexing
</commit_message>
<xml_diff>
--- a/Laravel/Laravel-notes-from-docs/Laravel-Notes-04.docx
+++ b/Laravel/Laravel-notes-from-docs/Laravel-Notes-04.docx
@@ -4,6 +4,9 @@
   <w:body>
     <w:p>
       <w:r>
+        <w:rPr>
+          <w:noProof/>
+        </w:rPr>
         <w:drawing>
           <wp:inline distT="0" distB="0" distL="0" distR="0" wp14:anchorId="0B3A6557" wp14:editId="06D4850B">
             <wp:extent cx="6663690" cy="3909060"/>
@@ -424,6 +427,7 @@
         </w:rPr>
         <w:t xml:space="preserve"> </w:t>
       </w:r>
+      <w:proofErr w:type="gramStart"/>
       <w:r>
         <w:rPr>
           <w:rFonts w:ascii="Consolas" w:eastAsia="Times New Roman" w:hAnsi="Consolas" w:cs="Times New Roman"/>
@@ -444,7 +448,19 @@
           <w:szCs w:val="21"/>
           <w14:ligatures w14:val="none"/>
         </w:rPr>
-        <w:t>()</w:t>
+        <w:t>(</w:t>
+      </w:r>
+      <w:proofErr w:type="gramEnd"/>
+      <w:r>
+        <w:rPr>
+          <w:rFonts w:ascii="Consolas" w:eastAsia="Times New Roman" w:hAnsi="Consolas" w:cs="Times New Roman"/>
+          <w:color w:val="000000"/>
+          <w:kern w:val="0"/>
+          <w:sz w:val="21"/>
+          <w:szCs w:val="21"/>
+          <w14:ligatures w14:val="none"/>
+        </w:rPr>
+        <w:t>)</w:t>
       </w:r>
     </w:p>
     <w:p>
@@ -675,6 +691,7 @@
         </w:rPr>
         <w:t xml:space="preserve">] = </w:t>
       </w:r>
+      <w:proofErr w:type="gramStart"/>
       <w:r>
         <w:rPr>
           <w:rFonts w:ascii="Consolas" w:eastAsia="Times New Roman" w:hAnsi="Consolas" w:cs="Times New Roman"/>
@@ -697,6 +714,7 @@
         </w:rPr>
         <w:t>::</w:t>
       </w:r>
+      <w:proofErr w:type="gramEnd"/>
       <w:r>
         <w:rPr>
           <w:rFonts w:ascii="Consolas" w:eastAsia="Times New Roman" w:hAnsi="Consolas" w:cs="Times New Roman"/>
@@ -741,6 +759,7 @@
         </w:rPr>
         <w:t>)-&gt;</w:t>
       </w:r>
+      <w:proofErr w:type="gramStart"/>
       <w:r>
         <w:rPr>
           <w:rFonts w:ascii="Consolas" w:eastAsia="Times New Roman" w:hAnsi="Consolas" w:cs="Times New Roman"/>
@@ -763,6 +782,7 @@
         </w:rPr>
         <w:t>(</w:t>
       </w:r>
+      <w:proofErr w:type="gramEnd"/>
     </w:p>
     <w:p>
       <w:pPr>
@@ -1017,6 +1037,7 @@
         </w:rPr>
         <w:t xml:space="preserve"> </w:t>
       </w:r>
+      <w:proofErr w:type="gramStart"/>
       <w:r>
         <w:rPr>
           <w:rFonts w:ascii="Consolas" w:eastAsia="Times New Roman" w:hAnsi="Consolas" w:cs="Times New Roman"/>
@@ -1059,7 +1080,19 @@
           <w:szCs w:val="21"/>
           <w14:ligatures w14:val="none"/>
         </w:rPr>
-        <w:t>([</w:t>
+        <w:t>(</w:t>
+      </w:r>
+      <w:proofErr w:type="gramEnd"/>
+      <w:r>
+        <w:rPr>
+          <w:rFonts w:ascii="Consolas" w:eastAsia="Times New Roman" w:hAnsi="Consolas" w:cs="Times New Roman"/>
+          <w:color w:val="000000"/>
+          <w:kern w:val="0"/>
+          <w:sz w:val="21"/>
+          <w:szCs w:val="21"/>
+          <w14:ligatures w14:val="none"/>
+        </w:rPr>
+        <w:t>[</w:t>
       </w:r>
     </w:p>
     <w:p>
@@ -1086,6 +1119,7 @@
         </w:rPr>
         <w:t xml:space="preserve">                    </w:t>
       </w:r>
+      <w:proofErr w:type="gramStart"/>
       <w:r>
         <w:rPr>
           <w:rFonts w:ascii="Consolas" w:eastAsia="Times New Roman" w:hAnsi="Consolas" w:cs="Times New Roman"/>
@@ -1106,8 +1140,21 @@
           <w:szCs w:val="21"/>
           <w14:ligatures w14:val="none"/>
         </w:rPr>
-        <w:t xml:space="preserve">() =&gt; </w:t>
-      </w:r>
+        <w:t>(</w:t>
+      </w:r>
+      <w:proofErr w:type="gramEnd"/>
+      <w:r>
+        <w:rPr>
+          <w:rFonts w:ascii="Consolas" w:eastAsia="Times New Roman" w:hAnsi="Consolas" w:cs="Times New Roman"/>
+          <w:color w:val="000000"/>
+          <w:kern w:val="0"/>
+          <w:sz w:val="21"/>
+          <w:szCs w:val="21"/>
+          <w14:ligatures w14:val="none"/>
+        </w:rPr>
+        <w:t xml:space="preserve">) =&gt; </w:t>
+      </w:r>
+      <w:proofErr w:type="gramStart"/>
       <w:r>
         <w:rPr>
           <w:rFonts w:ascii="Consolas" w:eastAsia="Times New Roman" w:hAnsi="Consolas" w:cs="Times New Roman"/>
@@ -1150,7 +1197,19 @@
           <w:szCs w:val="21"/>
           <w14:ligatures w14:val="none"/>
         </w:rPr>
-        <w:t>(),</w:t>
+        <w:t>(</w:t>
+      </w:r>
+      <w:proofErr w:type="gramEnd"/>
+      <w:r>
+        <w:rPr>
+          <w:rFonts w:ascii="Consolas" w:eastAsia="Times New Roman" w:hAnsi="Consolas" w:cs="Times New Roman"/>
+          <w:color w:val="000000"/>
+          <w:kern w:val="0"/>
+          <w:sz w:val="21"/>
+          <w:szCs w:val="21"/>
+          <w14:ligatures w14:val="none"/>
+        </w:rPr>
+        <w:t>),</w:t>
       </w:r>
     </w:p>
     <w:p>
@@ -1177,6 +1236,7 @@
         </w:rPr>
         <w:t xml:space="preserve">                    </w:t>
       </w:r>
+      <w:proofErr w:type="gramStart"/>
       <w:r>
         <w:rPr>
           <w:rFonts w:ascii="Consolas" w:eastAsia="Times New Roman" w:hAnsi="Consolas" w:cs="Times New Roman"/>
@@ -1197,8 +1257,21 @@
           <w:szCs w:val="21"/>
           <w14:ligatures w14:val="none"/>
         </w:rPr>
-        <w:t xml:space="preserve">() =&gt; </w:t>
-      </w:r>
+        <w:t>(</w:t>
+      </w:r>
+      <w:proofErr w:type="gramEnd"/>
+      <w:r>
+        <w:rPr>
+          <w:rFonts w:ascii="Consolas" w:eastAsia="Times New Roman" w:hAnsi="Consolas" w:cs="Times New Roman"/>
+          <w:color w:val="000000"/>
+          <w:kern w:val="0"/>
+          <w:sz w:val="21"/>
+          <w:szCs w:val="21"/>
+          <w14:ligatures w14:val="none"/>
+        </w:rPr>
+        <w:t xml:space="preserve">) =&gt; </w:t>
+      </w:r>
+      <w:proofErr w:type="gramStart"/>
       <w:r>
         <w:rPr>
           <w:rFonts w:ascii="Consolas" w:eastAsia="Times New Roman" w:hAnsi="Consolas" w:cs="Times New Roman"/>
@@ -1221,6 +1294,7 @@
         </w:rPr>
         <w:t>::</w:t>
       </w:r>
+      <w:proofErr w:type="gramEnd"/>
       <w:r>
         <w:rPr>
           <w:rFonts w:ascii="Consolas" w:eastAsia="Times New Roman" w:hAnsi="Consolas" w:cs="Times New Roman"/>
@@ -1265,6 +1339,7 @@
         </w:rPr>
         <w:t>)-&gt;</w:t>
       </w:r>
+      <w:proofErr w:type="gramStart"/>
       <w:r>
         <w:rPr>
           <w:rFonts w:ascii="Consolas" w:eastAsia="Times New Roman" w:hAnsi="Consolas" w:cs="Times New Roman"/>
@@ -1285,7 +1360,19 @@
           <w:szCs w:val="21"/>
           <w14:ligatures w14:val="none"/>
         </w:rPr>
-        <w:t>(),</w:t>
+        <w:t>(</w:t>
+      </w:r>
+      <w:proofErr w:type="gramEnd"/>
+      <w:r>
+        <w:rPr>
+          <w:rFonts w:ascii="Consolas" w:eastAsia="Times New Roman" w:hAnsi="Consolas" w:cs="Times New Roman"/>
+          <w:color w:val="000000"/>
+          <w:kern w:val="0"/>
+          <w:sz w:val="21"/>
+          <w:szCs w:val="21"/>
+          <w14:ligatures w14:val="none"/>
+        </w:rPr>
+        <w:t>),</w:t>
       </w:r>
     </w:p>
     <w:p>
@@ -1312,6 +1399,7 @@
         </w:rPr>
         <w:t xml:space="preserve">                    </w:t>
       </w:r>
+      <w:proofErr w:type="gramStart"/>
       <w:r>
         <w:rPr>
           <w:rFonts w:ascii="Consolas" w:eastAsia="Times New Roman" w:hAnsi="Consolas" w:cs="Times New Roman"/>
@@ -1332,8 +1420,21 @@
           <w:szCs w:val="21"/>
           <w14:ligatures w14:val="none"/>
         </w:rPr>
-        <w:t xml:space="preserve">() =&gt; </w:t>
-      </w:r>
+        <w:t>(</w:t>
+      </w:r>
+      <w:proofErr w:type="gramEnd"/>
+      <w:r>
+        <w:rPr>
+          <w:rFonts w:ascii="Consolas" w:eastAsia="Times New Roman" w:hAnsi="Consolas" w:cs="Times New Roman"/>
+          <w:color w:val="000000"/>
+          <w:kern w:val="0"/>
+          <w:sz w:val="21"/>
+          <w:szCs w:val="21"/>
+          <w14:ligatures w14:val="none"/>
+        </w:rPr>
+        <w:t xml:space="preserve">) =&gt; </w:t>
+      </w:r>
+      <w:proofErr w:type="gramStart"/>
       <w:r>
         <w:rPr>
           <w:rFonts w:ascii="Consolas" w:eastAsia="Times New Roman" w:hAnsi="Consolas" w:cs="Times New Roman"/>
@@ -1356,6 +1457,7 @@
         </w:rPr>
         <w:t>::</w:t>
       </w:r>
+      <w:proofErr w:type="gramEnd"/>
       <w:r>
         <w:rPr>
           <w:rFonts w:ascii="Consolas" w:eastAsia="Times New Roman" w:hAnsi="Consolas" w:cs="Times New Roman"/>
@@ -1400,6 +1502,7 @@
         </w:rPr>
         <w:t>)-&gt;</w:t>
       </w:r>
+      <w:proofErr w:type="gramStart"/>
       <w:r>
         <w:rPr>
           <w:rFonts w:ascii="Consolas" w:eastAsia="Times New Roman" w:hAnsi="Consolas" w:cs="Times New Roman"/>
@@ -1420,7 +1523,19 @@
           <w:szCs w:val="21"/>
           <w14:ligatures w14:val="none"/>
         </w:rPr>
-        <w:t>(),</w:t>
+        <w:t>(</w:t>
+      </w:r>
+      <w:proofErr w:type="gramEnd"/>
+      <w:r>
+        <w:rPr>
+          <w:rFonts w:ascii="Consolas" w:eastAsia="Times New Roman" w:hAnsi="Consolas" w:cs="Times New Roman"/>
+          <w:color w:val="000000"/>
+          <w:kern w:val="0"/>
+          <w:sz w:val="21"/>
+          <w:szCs w:val="21"/>
+          <w14:ligatures w14:val="none"/>
+        </w:rPr>
+        <w:t>),</w:t>
       </w:r>
     </w:p>
     <w:p>
@@ -1447,6 +1562,7 @@
         </w:rPr>
         <w:t xml:space="preserve">                    </w:t>
       </w:r>
+      <w:proofErr w:type="gramStart"/>
       <w:r>
         <w:rPr>
           <w:rFonts w:ascii="Consolas" w:eastAsia="Times New Roman" w:hAnsi="Consolas" w:cs="Times New Roman"/>
@@ -1467,8 +1583,21 @@
           <w:szCs w:val="21"/>
           <w14:ligatures w14:val="none"/>
         </w:rPr>
-        <w:t xml:space="preserve">() =&gt; </w:t>
-      </w:r>
+        <w:t>(</w:t>
+      </w:r>
+      <w:proofErr w:type="gramEnd"/>
+      <w:r>
+        <w:rPr>
+          <w:rFonts w:ascii="Consolas" w:eastAsia="Times New Roman" w:hAnsi="Consolas" w:cs="Times New Roman"/>
+          <w:color w:val="000000"/>
+          <w:kern w:val="0"/>
+          <w:sz w:val="21"/>
+          <w:szCs w:val="21"/>
+          <w14:ligatures w14:val="none"/>
+        </w:rPr>
+        <w:t xml:space="preserve">) =&gt; </w:t>
+      </w:r>
+      <w:proofErr w:type="gramStart"/>
       <w:r>
         <w:rPr>
           <w:rFonts w:ascii="Consolas" w:eastAsia="Times New Roman" w:hAnsi="Consolas" w:cs="Times New Roman"/>
@@ -1491,6 +1620,7 @@
         </w:rPr>
         <w:t>::</w:t>
       </w:r>
+      <w:proofErr w:type="gramEnd"/>
       <w:r>
         <w:rPr>
           <w:rFonts w:ascii="Consolas" w:eastAsia="Times New Roman" w:hAnsi="Consolas" w:cs="Times New Roman"/>
@@ -1535,6 +1665,7 @@
         </w:rPr>
         <w:t>)-&gt;</w:t>
       </w:r>
+      <w:proofErr w:type="gramStart"/>
       <w:r>
         <w:rPr>
           <w:rFonts w:ascii="Consolas" w:eastAsia="Times New Roman" w:hAnsi="Consolas" w:cs="Times New Roman"/>
@@ -1555,7 +1686,19 @@
           <w:szCs w:val="21"/>
           <w14:ligatures w14:val="none"/>
         </w:rPr>
-        <w:t>(),</w:t>
+        <w:t>(</w:t>
+      </w:r>
+      <w:proofErr w:type="gramEnd"/>
+      <w:r>
+        <w:rPr>
+          <w:rFonts w:ascii="Consolas" w:eastAsia="Times New Roman" w:hAnsi="Consolas" w:cs="Times New Roman"/>
+          <w:color w:val="000000"/>
+          <w:kern w:val="0"/>
+          <w:sz w:val="21"/>
+          <w:szCs w:val="21"/>
+          <w14:ligatures w14:val="none"/>
+        </w:rPr>
+        <w:t>),</w:t>
       </w:r>
     </w:p>
     <w:p>
@@ -1828,6 +1971,7 @@
         </w:rPr>
         <w:t xml:space="preserve"> </w:t>
       </w:r>
+      <w:proofErr w:type="gramStart"/>
       <w:r>
         <w:rPr>
           <w:rFonts w:ascii="Consolas" w:eastAsia="Times New Roman" w:hAnsi="Consolas" w:cs="Times New Roman"/>
@@ -1848,8 +1992,21 @@
           <w:szCs w:val="21"/>
           <w14:ligatures w14:val="none"/>
         </w:rPr>
-        <w:t>()-&gt;</w:t>
-      </w:r>
+        <w:t>(</w:t>
+      </w:r>
+      <w:proofErr w:type="gramEnd"/>
+      <w:r>
+        <w:rPr>
+          <w:rFonts w:ascii="Consolas" w:eastAsia="Times New Roman" w:hAnsi="Consolas" w:cs="Times New Roman"/>
+          <w:color w:val="000000"/>
+          <w:kern w:val="0"/>
+          <w:sz w:val="21"/>
+          <w:szCs w:val="21"/>
+          <w14:ligatures w14:val="none"/>
+        </w:rPr>
+        <w:t>)-&gt;</w:t>
+      </w:r>
+      <w:proofErr w:type="gramStart"/>
       <w:r>
         <w:rPr>
           <w:rFonts w:ascii="Consolas" w:eastAsia="Times New Roman" w:hAnsi="Consolas" w:cs="Times New Roman"/>
@@ -1870,7 +2027,19 @@
           <w:szCs w:val="21"/>
           <w14:ligatures w14:val="none"/>
         </w:rPr>
-        <w:t>([</w:t>
+        <w:t>(</w:t>
+      </w:r>
+      <w:proofErr w:type="gramEnd"/>
+      <w:r>
+        <w:rPr>
+          <w:rFonts w:ascii="Consolas" w:eastAsia="Times New Roman" w:hAnsi="Consolas" w:cs="Times New Roman"/>
+          <w:color w:val="000000"/>
+          <w:kern w:val="0"/>
+          <w:sz w:val="21"/>
+          <w:szCs w:val="21"/>
+          <w14:ligatures w14:val="none"/>
+        </w:rPr>
+        <w:t>[</w:t>
       </w:r>
     </w:p>
     <w:p>
@@ -2275,6 +2444,1429 @@
       <w:r>
         <w:t>=====================================================</w:t>
       </w:r>
+    </w:p>
+    <w:p>
+      <w:pPr>
+        <w:rPr>
+          <w:rFonts w:ascii="Sakkal Majalla" w:hAnsi="Sakkal Majalla" w:cs="Sakkal Majalla"/>
+          <w:sz w:val="28"/>
+          <w:szCs w:val="28"/>
+        </w:rPr>
+      </w:pPr>
+      <w:r>
+        <w:rPr>
+          <w:rFonts w:ascii="Sakkal Majalla" w:hAnsi="Sakkal Majalla" w:cs="Sakkal Majalla"/>
+          <w:sz w:val="28"/>
+          <w:szCs w:val="28"/>
+        </w:rPr>
+        <w:t xml:space="preserve">To create </w:t>
+      </w:r>
+      <w:r>
+        <w:rPr>
+          <w:rFonts w:ascii="Sakkal Majalla" w:hAnsi="Sakkal Majalla" w:cs="Sakkal Majalla"/>
+          <w:sz w:val="28"/>
+          <w:szCs w:val="28"/>
+        </w:rPr>
+        <w:t xml:space="preserve">a </w:t>
+      </w:r>
+      <w:r>
+        <w:rPr>
+          <w:rFonts w:ascii="Sakkal Majalla" w:hAnsi="Sakkal Majalla" w:cs="Sakkal Majalla"/>
+          <w:sz w:val="28"/>
+          <w:szCs w:val="28"/>
+        </w:rPr>
+        <w:t>full</w:t>
+      </w:r>
+      <w:r>
+        <w:rPr>
+          <w:rFonts w:ascii="Sakkal Majalla" w:hAnsi="Sakkal Majalla" w:cs="Sakkal Majalla"/>
+          <w:sz w:val="28"/>
+          <w:szCs w:val="28"/>
+        </w:rPr>
+        <w:t>-</w:t>
+      </w:r>
+      <w:r>
+        <w:rPr>
+          <w:rFonts w:ascii="Sakkal Majalla" w:hAnsi="Sakkal Majalla" w:cs="Sakkal Majalla"/>
+          <w:sz w:val="28"/>
+          <w:szCs w:val="28"/>
+        </w:rPr>
+        <w:t>text index:</w:t>
+      </w:r>
+    </w:p>
+    <w:p>
+      <w:pPr>
+        <w:shd w:val="clear" w:color="auto" w:fill="FFFFFF"/>
+        <w:spacing w:after="0" w:line="285" w:lineRule="atLeast"/>
+        <w:rPr>
+          <w:rFonts w:ascii="Consolas" w:eastAsia="Times New Roman" w:hAnsi="Consolas" w:cs="Times New Roman"/>
+          <w:color w:val="3B3B3B"/>
+          <w:kern w:val="0"/>
+          <w:sz w:val="21"/>
+          <w:szCs w:val="21"/>
+          <w14:ligatures w14:val="none"/>
+        </w:rPr>
+      </w:pPr>
+      <w:r>
+        <w:rPr>
+          <w:rFonts w:ascii="Consolas" w:eastAsia="Times New Roman" w:hAnsi="Consolas" w:cs="Times New Roman"/>
+          <w:color w:val="0000FF"/>
+          <w:kern w:val="0"/>
+          <w:sz w:val="21"/>
+          <w:szCs w:val="21"/>
+          <w14:ligatures w14:val="none"/>
+        </w:rPr>
+        <w:t>public</w:t>
+      </w:r>
+      <w:r>
+        <w:rPr>
+          <w:rFonts w:ascii="Consolas" w:eastAsia="Times New Roman" w:hAnsi="Consolas" w:cs="Times New Roman"/>
+          <w:color w:val="000000"/>
+          <w:kern w:val="0"/>
+          <w:sz w:val="21"/>
+          <w:szCs w:val="21"/>
+          <w14:ligatures w14:val="none"/>
+        </w:rPr>
+        <w:t xml:space="preserve"> </w:t>
+      </w:r>
+      <w:r>
+        <w:rPr>
+          <w:rFonts w:ascii="Consolas" w:eastAsia="Times New Roman" w:hAnsi="Consolas" w:cs="Times New Roman"/>
+          <w:color w:val="0000FF"/>
+          <w:kern w:val="0"/>
+          <w:sz w:val="21"/>
+          <w:szCs w:val="21"/>
+          <w14:ligatures w14:val="none"/>
+        </w:rPr>
+        <w:t>function</w:t>
+      </w:r>
+      <w:r>
+        <w:rPr>
+          <w:rFonts w:ascii="Consolas" w:eastAsia="Times New Roman" w:hAnsi="Consolas" w:cs="Times New Roman"/>
+          <w:color w:val="000000"/>
+          <w:kern w:val="0"/>
+          <w:sz w:val="21"/>
+          <w:szCs w:val="21"/>
+          <w14:ligatures w14:val="none"/>
+        </w:rPr>
+        <w:t xml:space="preserve"> </w:t>
+      </w:r>
+      <w:proofErr w:type="gramStart"/>
+      <w:r>
+        <w:rPr>
+          <w:rFonts w:ascii="Consolas" w:eastAsia="Times New Roman" w:hAnsi="Consolas" w:cs="Times New Roman"/>
+          <w:color w:val="795E26"/>
+          <w:kern w:val="0"/>
+          <w:sz w:val="21"/>
+          <w:szCs w:val="21"/>
+          <w14:ligatures w14:val="none"/>
+        </w:rPr>
+        <w:t>up</w:t>
+      </w:r>
+      <w:r>
+        <w:rPr>
+          <w:rFonts w:ascii="Consolas" w:eastAsia="Times New Roman" w:hAnsi="Consolas" w:cs="Times New Roman"/>
+          <w:color w:val="000000"/>
+          <w:kern w:val="0"/>
+          <w:sz w:val="21"/>
+          <w:szCs w:val="21"/>
+          <w14:ligatures w14:val="none"/>
+        </w:rPr>
+        <w:t>(</w:t>
+      </w:r>
+      <w:proofErr w:type="gramEnd"/>
+      <w:r>
+        <w:rPr>
+          <w:rFonts w:ascii="Consolas" w:eastAsia="Times New Roman" w:hAnsi="Consolas" w:cs="Times New Roman"/>
+          <w:color w:val="000000"/>
+          <w:kern w:val="0"/>
+          <w:sz w:val="21"/>
+          <w:szCs w:val="21"/>
+          <w14:ligatures w14:val="none"/>
+        </w:rPr>
+        <w:t xml:space="preserve">): </w:t>
+      </w:r>
+      <w:r>
+        <w:rPr>
+          <w:rFonts w:ascii="Consolas" w:eastAsia="Times New Roman" w:hAnsi="Consolas" w:cs="Times New Roman"/>
+          <w:color w:val="0000FF"/>
+          <w:kern w:val="0"/>
+          <w:sz w:val="21"/>
+          <w:szCs w:val="21"/>
+          <w14:ligatures w14:val="none"/>
+        </w:rPr>
+        <w:t>void</w:t>
+      </w:r>
+    </w:p>
+    <w:p>
+      <w:pPr>
+        <w:shd w:val="clear" w:color="auto" w:fill="FFFFFF"/>
+        <w:spacing w:after="0" w:line="285" w:lineRule="atLeast"/>
+        <w:rPr>
+          <w:rFonts w:ascii="Consolas" w:eastAsia="Times New Roman" w:hAnsi="Consolas" w:cs="Times New Roman"/>
+          <w:color w:val="3B3B3B"/>
+          <w:kern w:val="0"/>
+          <w:sz w:val="21"/>
+          <w:szCs w:val="21"/>
+          <w14:ligatures w14:val="none"/>
+        </w:rPr>
+      </w:pPr>
+      <w:r>
+        <w:rPr>
+          <w:rFonts w:ascii="Consolas" w:eastAsia="Times New Roman" w:hAnsi="Consolas" w:cs="Times New Roman"/>
+          <w:color w:val="000000"/>
+          <w:kern w:val="0"/>
+          <w:sz w:val="21"/>
+          <w:szCs w:val="21"/>
+          <w14:ligatures w14:val="none"/>
+        </w:rPr>
+        <w:t>{</w:t>
+      </w:r>
+    </w:p>
+    <w:p>
+      <w:pPr>
+        <w:shd w:val="clear" w:color="auto" w:fill="FFFFFF"/>
+        <w:spacing w:after="0" w:line="285" w:lineRule="atLeast"/>
+        <w:rPr>
+          <w:rFonts w:ascii="Consolas" w:eastAsia="Times New Roman" w:hAnsi="Consolas" w:cs="Times New Roman"/>
+          <w:color w:val="3B3B3B"/>
+          <w:kern w:val="0"/>
+          <w:sz w:val="21"/>
+          <w:szCs w:val="21"/>
+          <w14:ligatures w14:val="none"/>
+        </w:rPr>
+      </w:pPr>
+      <w:r>
+        <w:rPr>
+          <w:rFonts w:ascii="Consolas" w:eastAsia="Times New Roman" w:hAnsi="Consolas" w:cs="Times New Roman"/>
+          <w:color w:val="000000"/>
+          <w:kern w:val="0"/>
+          <w:sz w:val="21"/>
+          <w:szCs w:val="21"/>
+          <w14:ligatures w14:val="none"/>
+        </w:rPr>
+        <w:t xml:space="preserve">        </w:t>
+      </w:r>
+      <w:proofErr w:type="gramStart"/>
+      <w:r>
+        <w:rPr>
+          <w:rFonts w:ascii="Consolas" w:eastAsia="Times New Roman" w:hAnsi="Consolas" w:cs="Times New Roman"/>
+          <w:color w:val="267F99"/>
+          <w:kern w:val="0"/>
+          <w:sz w:val="21"/>
+          <w:szCs w:val="21"/>
+          <w14:ligatures w14:val="none"/>
+        </w:rPr>
+        <w:t>Schema</w:t>
+      </w:r>
+      <w:r>
+        <w:rPr>
+          <w:rFonts w:ascii="Consolas" w:eastAsia="Times New Roman" w:hAnsi="Consolas" w:cs="Times New Roman"/>
+          <w:color w:val="000000"/>
+          <w:kern w:val="0"/>
+          <w:sz w:val="21"/>
+          <w:szCs w:val="21"/>
+          <w14:ligatures w14:val="none"/>
+        </w:rPr>
+        <w:t>::</w:t>
+      </w:r>
+      <w:r>
+        <w:rPr>
+          <w:rFonts w:ascii="Consolas" w:eastAsia="Times New Roman" w:hAnsi="Consolas" w:cs="Times New Roman"/>
+          <w:color w:val="795E26"/>
+          <w:kern w:val="0"/>
+          <w:sz w:val="21"/>
+          <w:szCs w:val="21"/>
+          <w14:ligatures w14:val="none"/>
+        </w:rPr>
+        <w:t>table</w:t>
+      </w:r>
+      <w:r>
+        <w:rPr>
+          <w:rFonts w:ascii="Consolas" w:eastAsia="Times New Roman" w:hAnsi="Consolas" w:cs="Times New Roman"/>
+          <w:color w:val="000000"/>
+          <w:kern w:val="0"/>
+          <w:sz w:val="21"/>
+          <w:szCs w:val="21"/>
+          <w14:ligatures w14:val="none"/>
+        </w:rPr>
+        <w:t>(</w:t>
+      </w:r>
+      <w:proofErr w:type="gramEnd"/>
+      <w:r>
+        <w:rPr>
+          <w:rFonts w:ascii="Consolas" w:eastAsia="Times New Roman" w:hAnsi="Consolas" w:cs="Times New Roman"/>
+          <w:color w:val="A31515"/>
+          <w:kern w:val="0"/>
+          <w:sz w:val="21"/>
+          <w:szCs w:val="21"/>
+          <w14:ligatures w14:val="none"/>
+        </w:rPr>
+        <w:t>'events'</w:t>
+      </w:r>
+      <w:r>
+        <w:rPr>
+          <w:rFonts w:ascii="Consolas" w:eastAsia="Times New Roman" w:hAnsi="Consolas" w:cs="Times New Roman"/>
+          <w:color w:val="000000"/>
+          <w:kern w:val="0"/>
+          <w:sz w:val="21"/>
+          <w:szCs w:val="21"/>
+          <w14:ligatures w14:val="none"/>
+        </w:rPr>
+        <w:t xml:space="preserve">, </w:t>
+      </w:r>
+      <w:r>
+        <w:rPr>
+          <w:rFonts w:ascii="Consolas" w:eastAsia="Times New Roman" w:hAnsi="Consolas" w:cs="Times New Roman"/>
+          <w:color w:val="0000FF"/>
+          <w:kern w:val="0"/>
+          <w:sz w:val="21"/>
+          <w:szCs w:val="21"/>
+          <w14:ligatures w14:val="none"/>
+        </w:rPr>
+        <w:t>function</w:t>
+      </w:r>
+      <w:r>
+        <w:rPr>
+          <w:rFonts w:ascii="Consolas" w:eastAsia="Times New Roman" w:hAnsi="Consolas" w:cs="Times New Roman"/>
+          <w:color w:val="000000"/>
+          <w:kern w:val="0"/>
+          <w:sz w:val="21"/>
+          <w:szCs w:val="21"/>
+          <w14:ligatures w14:val="none"/>
+        </w:rPr>
+        <w:t xml:space="preserve"> (</w:t>
+      </w:r>
+      <w:r>
+        <w:rPr>
+          <w:rFonts w:ascii="Consolas" w:eastAsia="Times New Roman" w:hAnsi="Consolas" w:cs="Times New Roman"/>
+          <w:color w:val="267F99"/>
+          <w:kern w:val="0"/>
+          <w:sz w:val="21"/>
+          <w:szCs w:val="21"/>
+          <w14:ligatures w14:val="none"/>
+        </w:rPr>
+        <w:t>Blueprint</w:t>
+      </w:r>
+      <w:r>
+        <w:rPr>
+          <w:rFonts w:ascii="Consolas" w:eastAsia="Times New Roman" w:hAnsi="Consolas" w:cs="Times New Roman"/>
+          <w:color w:val="000000"/>
+          <w:kern w:val="0"/>
+          <w:sz w:val="21"/>
+          <w:szCs w:val="21"/>
+          <w14:ligatures w14:val="none"/>
+        </w:rPr>
+        <w:t xml:space="preserve"> </w:t>
+      </w:r>
+      <w:r>
+        <w:rPr>
+          <w:rFonts w:ascii="Consolas" w:eastAsia="Times New Roman" w:hAnsi="Consolas" w:cs="Times New Roman"/>
+          <w:color w:val="001080"/>
+          <w:kern w:val="0"/>
+          <w:sz w:val="21"/>
+          <w:szCs w:val="21"/>
+          <w14:ligatures w14:val="none"/>
+        </w:rPr>
+        <w:t>$table</w:t>
+      </w:r>
+      <w:r>
+        <w:rPr>
+          <w:rFonts w:ascii="Consolas" w:eastAsia="Times New Roman" w:hAnsi="Consolas" w:cs="Times New Roman"/>
+          <w:color w:val="000000"/>
+          <w:kern w:val="0"/>
+          <w:sz w:val="21"/>
+          <w:szCs w:val="21"/>
+          <w14:ligatures w14:val="none"/>
+        </w:rPr>
+        <w:t>) {</w:t>
+      </w:r>
+    </w:p>
+    <w:p>
+      <w:pPr>
+        <w:shd w:val="clear" w:color="auto" w:fill="FFFFFF"/>
+        <w:spacing w:after="0" w:line="285" w:lineRule="atLeast"/>
+        <w:rPr>
+          <w:rFonts w:ascii="Consolas" w:eastAsia="Times New Roman" w:hAnsi="Consolas" w:cs="Times New Roman"/>
+          <w:color w:val="3B3B3B"/>
+          <w:kern w:val="0"/>
+          <w:sz w:val="21"/>
+          <w:szCs w:val="21"/>
+          <w14:ligatures w14:val="none"/>
+        </w:rPr>
+      </w:pPr>
+      <w:r>
+        <w:rPr>
+          <w:rFonts w:ascii="Consolas" w:eastAsia="Times New Roman" w:hAnsi="Consolas" w:cs="Times New Roman"/>
+          <w:color w:val="000000"/>
+          <w:kern w:val="0"/>
+          <w:sz w:val="21"/>
+          <w:szCs w:val="21"/>
+          <w14:ligatures w14:val="none"/>
+        </w:rPr>
+        <w:t xml:space="preserve">            </w:t>
+      </w:r>
+      <w:r>
+        <w:rPr>
+          <w:rFonts w:ascii="Consolas" w:eastAsia="Times New Roman" w:hAnsi="Consolas" w:cs="Times New Roman"/>
+          <w:color w:val="001080"/>
+          <w:kern w:val="0"/>
+          <w:sz w:val="21"/>
+          <w:szCs w:val="21"/>
+          <w14:ligatures w14:val="none"/>
+        </w:rPr>
+        <w:t>$table</w:t>
+      </w:r>
+      <w:r>
+        <w:rPr>
+          <w:rFonts w:ascii="Consolas" w:eastAsia="Times New Roman" w:hAnsi="Consolas" w:cs="Times New Roman"/>
+          <w:color w:val="000000"/>
+          <w:kern w:val="0"/>
+          <w:sz w:val="21"/>
+          <w:szCs w:val="21"/>
+          <w14:ligatures w14:val="none"/>
+        </w:rPr>
+        <w:t>-&gt;</w:t>
+      </w:r>
+      <w:proofErr w:type="gramStart"/>
+      <w:r>
+        <w:rPr>
+          <w:rFonts w:ascii="Consolas" w:eastAsia="Times New Roman" w:hAnsi="Consolas" w:cs="Times New Roman"/>
+          <w:color w:val="795E26"/>
+          <w:kern w:val="0"/>
+          <w:sz w:val="21"/>
+          <w:szCs w:val="21"/>
+          <w14:ligatures w14:val="none"/>
+        </w:rPr>
+        <w:t>fullText</w:t>
+      </w:r>
+      <w:r>
+        <w:rPr>
+          <w:rFonts w:ascii="Consolas" w:eastAsia="Times New Roman" w:hAnsi="Consolas" w:cs="Times New Roman"/>
+          <w:color w:val="000000"/>
+          <w:kern w:val="0"/>
+          <w:sz w:val="21"/>
+          <w:szCs w:val="21"/>
+          <w14:ligatures w14:val="none"/>
+        </w:rPr>
+        <w:t>(</w:t>
+      </w:r>
+      <w:proofErr w:type="gramEnd"/>
+      <w:r>
+        <w:rPr>
+          <w:rFonts w:ascii="Consolas" w:eastAsia="Times New Roman" w:hAnsi="Consolas" w:cs="Times New Roman"/>
+          <w:color w:val="A31515"/>
+          <w:kern w:val="0"/>
+          <w:sz w:val="21"/>
+          <w:szCs w:val="21"/>
+          <w14:ligatures w14:val="none"/>
+        </w:rPr>
+        <w:t>'description'</w:t>
+      </w:r>
+      <w:r>
+        <w:rPr>
+          <w:rFonts w:ascii="Consolas" w:eastAsia="Times New Roman" w:hAnsi="Consolas" w:cs="Times New Roman"/>
+          <w:color w:val="000000"/>
+          <w:kern w:val="0"/>
+          <w:sz w:val="21"/>
+          <w:szCs w:val="21"/>
+          <w14:ligatures w14:val="none"/>
+        </w:rPr>
+        <w:t xml:space="preserve">, </w:t>
+      </w:r>
+      <w:r>
+        <w:rPr>
+          <w:rFonts w:ascii="Consolas" w:eastAsia="Times New Roman" w:hAnsi="Consolas" w:cs="Times New Roman"/>
+          <w:color w:val="A31515"/>
+          <w:kern w:val="0"/>
+          <w:sz w:val="21"/>
+          <w:szCs w:val="21"/>
+          <w14:ligatures w14:val="none"/>
+        </w:rPr>
+        <w:t>'event_description_fulltext_index'</w:t>
+      </w:r>
+      <w:r>
+        <w:rPr>
+          <w:rFonts w:ascii="Consolas" w:eastAsia="Times New Roman" w:hAnsi="Consolas" w:cs="Times New Roman"/>
+          <w:color w:val="000000"/>
+          <w:kern w:val="0"/>
+          <w:sz w:val="21"/>
+          <w:szCs w:val="21"/>
+          <w14:ligatures w14:val="none"/>
+        </w:rPr>
+        <w:t>);</w:t>
+      </w:r>
+    </w:p>
+    <w:p>
+      <w:pPr>
+        <w:shd w:val="clear" w:color="auto" w:fill="FFFFFF"/>
+        <w:spacing w:after="0" w:line="285" w:lineRule="atLeast"/>
+        <w:rPr>
+          <w:rFonts w:ascii="Consolas" w:eastAsia="Times New Roman" w:hAnsi="Consolas" w:cs="Times New Roman"/>
+          <w:color w:val="3B3B3B"/>
+          <w:kern w:val="0"/>
+          <w:sz w:val="21"/>
+          <w:szCs w:val="21"/>
+          <w14:ligatures w14:val="none"/>
+        </w:rPr>
+      </w:pPr>
+      <w:r>
+        <w:rPr>
+          <w:rFonts w:ascii="Consolas" w:eastAsia="Times New Roman" w:hAnsi="Consolas" w:cs="Times New Roman"/>
+          <w:color w:val="000000"/>
+          <w:kern w:val="0"/>
+          <w:sz w:val="21"/>
+          <w:szCs w:val="21"/>
+          <w14:ligatures w14:val="none"/>
+        </w:rPr>
+        <w:t>        });</w:t>
+      </w:r>
+    </w:p>
+    <w:p>
+      <w:pPr>
+        <w:shd w:val="clear" w:color="auto" w:fill="FFFFFF"/>
+        <w:spacing w:after="0" w:line="285" w:lineRule="atLeast"/>
+        <w:rPr>
+          <w:rFonts w:ascii="Consolas" w:eastAsia="Times New Roman" w:hAnsi="Consolas" w:cs="Times New Roman"/>
+          <w:color w:val="3B3B3B"/>
+          <w:kern w:val="0"/>
+          <w:sz w:val="21"/>
+          <w:szCs w:val="21"/>
+          <w14:ligatures w14:val="none"/>
+        </w:rPr>
+      </w:pPr>
+      <w:r>
+        <w:rPr>
+          <w:rFonts w:ascii="Consolas" w:eastAsia="Times New Roman" w:hAnsi="Consolas" w:cs="Times New Roman"/>
+          <w:color w:val="000000"/>
+          <w:kern w:val="0"/>
+          <w:sz w:val="21"/>
+          <w:szCs w:val="21"/>
+          <w14:ligatures w14:val="none"/>
+        </w:rPr>
+        <w:t>}</w:t>
+      </w:r>
+    </w:p>
+    <w:p>
+      <w:pPr>
+        <w:rPr>
+          <w:rFonts w:ascii="Sakkal Majalla" w:hAnsi="Sakkal Majalla" w:cs="Sakkal Majalla"/>
+          <w:sz w:val="28"/>
+          <w:szCs w:val="28"/>
+        </w:rPr>
+      </w:pPr>
+    </w:p>
+    <w:p>
+      <w:pPr>
+        <w:rPr>
+          <w:rFonts w:ascii="Sakkal Majalla" w:hAnsi="Sakkal Majalla" w:cs="Sakkal Majalla"/>
+          <w:sz w:val="28"/>
+          <w:szCs w:val="28"/>
+        </w:rPr>
+      </w:pPr>
+    </w:p>
+    <w:p>
+      <w:pPr>
+        <w:rPr>
+          <w:rFonts w:ascii="Sakkal Majalla" w:hAnsi="Sakkal Majalla" w:cs="Sakkal Majalla"/>
+          <w:sz w:val="28"/>
+          <w:szCs w:val="28"/>
+        </w:rPr>
+      </w:pPr>
+    </w:p>
+    <w:p>
+      <w:pPr>
+        <w:rPr>
+          <w:rFonts w:ascii="Sakkal Majalla" w:hAnsi="Sakkal Majalla" w:cs="Sakkal Majalla"/>
+          <w:sz w:val="28"/>
+          <w:szCs w:val="28"/>
+        </w:rPr>
+      </w:pPr>
+    </w:p>
+    <w:p>
+      <w:pPr>
+        <w:rPr>
+          <w:rFonts w:ascii="Sakkal Majalla" w:hAnsi="Sakkal Majalla" w:cs="Sakkal Majalla"/>
+          <w:sz w:val="28"/>
+          <w:szCs w:val="28"/>
+        </w:rPr>
+      </w:pPr>
+    </w:p>
+    <w:p>
+      <w:pPr>
+        <w:rPr>
+          <w:rFonts w:ascii="Sakkal Majalla" w:hAnsi="Sakkal Majalla" w:cs="Sakkal Majalla"/>
+          <w:sz w:val="28"/>
+          <w:szCs w:val="28"/>
+        </w:rPr>
+      </w:pPr>
+      <w:r>
+        <w:rPr>
+          <w:rFonts w:ascii="Sakkal Majalla" w:hAnsi="Sakkal Majalla" w:cs="Sakkal Majalla"/>
+          <w:sz w:val="28"/>
+          <w:szCs w:val="28"/>
+        </w:rPr>
+        <w:lastRenderedPageBreak/>
+        <w:t>And to use it with Laravel ORM</w:t>
+      </w:r>
+    </w:p>
+    <w:p>
+      <w:pPr>
+        <w:shd w:val="clear" w:color="auto" w:fill="FFFFFF"/>
+        <w:spacing w:after="0" w:line="285" w:lineRule="atLeast"/>
+        <w:rPr>
+          <w:rFonts w:ascii="Consolas" w:eastAsia="Times New Roman" w:hAnsi="Consolas" w:cs="Times New Roman"/>
+          <w:color w:val="3B3B3B"/>
+          <w:kern w:val="0"/>
+          <w:sz w:val="21"/>
+          <w:szCs w:val="21"/>
+          <w14:ligatures w14:val="none"/>
+        </w:rPr>
+      </w:pPr>
+      <w:r>
+        <w:rPr>
+          <w:rFonts w:ascii="Consolas" w:eastAsia="Times New Roman" w:hAnsi="Consolas" w:cs="Times New Roman"/>
+          <w:color w:val="0000FF"/>
+          <w:kern w:val="0"/>
+          <w:sz w:val="21"/>
+          <w:szCs w:val="21"/>
+          <w14:ligatures w14:val="none"/>
+        </w:rPr>
+        <w:t>class</w:t>
+      </w:r>
+      <w:r>
+        <w:rPr>
+          <w:rFonts w:ascii="Consolas" w:eastAsia="Times New Roman" w:hAnsi="Consolas" w:cs="Times New Roman"/>
+          <w:color w:val="000000"/>
+          <w:kern w:val="0"/>
+          <w:sz w:val="21"/>
+          <w:szCs w:val="21"/>
+          <w14:ligatures w14:val="none"/>
+        </w:rPr>
+        <w:t xml:space="preserve"> </w:t>
+      </w:r>
+      <w:r>
+        <w:rPr>
+          <w:rFonts w:ascii="Consolas" w:eastAsia="Times New Roman" w:hAnsi="Consolas" w:cs="Times New Roman"/>
+          <w:color w:val="267F99"/>
+          <w:kern w:val="0"/>
+          <w:sz w:val="21"/>
+          <w:szCs w:val="21"/>
+          <w14:ligatures w14:val="none"/>
+        </w:rPr>
+        <w:t>Event</w:t>
+      </w:r>
+      <w:r>
+        <w:rPr>
+          <w:rFonts w:ascii="Consolas" w:eastAsia="Times New Roman" w:hAnsi="Consolas" w:cs="Times New Roman"/>
+          <w:color w:val="000000"/>
+          <w:kern w:val="0"/>
+          <w:sz w:val="21"/>
+          <w:szCs w:val="21"/>
+          <w14:ligatures w14:val="none"/>
+        </w:rPr>
+        <w:t xml:space="preserve"> </w:t>
+      </w:r>
+      <w:r>
+        <w:rPr>
+          <w:rFonts w:ascii="Consolas" w:eastAsia="Times New Roman" w:hAnsi="Consolas" w:cs="Times New Roman"/>
+          <w:color w:val="0000FF"/>
+          <w:kern w:val="0"/>
+          <w:sz w:val="21"/>
+          <w:szCs w:val="21"/>
+          <w14:ligatures w14:val="none"/>
+        </w:rPr>
+        <w:t>extends</w:t>
+      </w:r>
+      <w:r>
+        <w:rPr>
+          <w:rFonts w:ascii="Consolas" w:eastAsia="Times New Roman" w:hAnsi="Consolas" w:cs="Times New Roman"/>
+          <w:color w:val="000000"/>
+          <w:kern w:val="0"/>
+          <w:sz w:val="21"/>
+          <w:szCs w:val="21"/>
+          <w14:ligatures w14:val="none"/>
+        </w:rPr>
+        <w:t xml:space="preserve"> </w:t>
+      </w:r>
+      <w:r>
+        <w:rPr>
+          <w:rFonts w:ascii="Consolas" w:eastAsia="Times New Roman" w:hAnsi="Consolas" w:cs="Times New Roman"/>
+          <w:color w:val="267F99"/>
+          <w:kern w:val="0"/>
+          <w:sz w:val="21"/>
+          <w:szCs w:val="21"/>
+          <w14:ligatures w14:val="none"/>
+        </w:rPr>
+        <w:t>Model</w:t>
+      </w:r>
+    </w:p>
+    <w:p>
+      <w:pPr>
+        <w:shd w:val="clear" w:color="auto" w:fill="FFFFFF"/>
+        <w:spacing w:after="0" w:line="285" w:lineRule="atLeast"/>
+        <w:rPr>
+          <w:rFonts w:ascii="Consolas" w:eastAsia="Times New Roman" w:hAnsi="Consolas" w:cs="Times New Roman"/>
+          <w:color w:val="3B3B3B"/>
+          <w:kern w:val="0"/>
+          <w:sz w:val="21"/>
+          <w:szCs w:val="21"/>
+          <w14:ligatures w14:val="none"/>
+        </w:rPr>
+      </w:pPr>
+      <w:r>
+        <w:rPr>
+          <w:rFonts w:ascii="Consolas" w:eastAsia="Times New Roman" w:hAnsi="Consolas" w:cs="Times New Roman"/>
+          <w:color w:val="000000"/>
+          <w:kern w:val="0"/>
+          <w:sz w:val="21"/>
+          <w:szCs w:val="21"/>
+          <w14:ligatures w14:val="none"/>
+        </w:rPr>
+        <w:t>{</w:t>
+      </w:r>
+    </w:p>
+    <w:p>
+      <w:pPr>
+        <w:shd w:val="clear" w:color="auto" w:fill="FFFFFF"/>
+        <w:spacing w:after="0" w:line="285" w:lineRule="atLeast"/>
+        <w:rPr>
+          <w:rFonts w:ascii="Consolas" w:eastAsia="Times New Roman" w:hAnsi="Consolas" w:cs="Times New Roman"/>
+          <w:color w:val="3B3B3B"/>
+          <w:kern w:val="0"/>
+          <w:sz w:val="21"/>
+          <w:szCs w:val="21"/>
+          <w14:ligatures w14:val="none"/>
+        </w:rPr>
+      </w:pPr>
+      <w:r>
+        <w:rPr>
+          <w:rFonts w:ascii="Consolas" w:eastAsia="Times New Roman" w:hAnsi="Consolas" w:cs="Times New Roman"/>
+          <w:color w:val="000000"/>
+          <w:kern w:val="0"/>
+          <w:sz w:val="21"/>
+          <w:szCs w:val="21"/>
+          <w14:ligatures w14:val="none"/>
+        </w:rPr>
+        <w:t xml:space="preserve">    </w:t>
+      </w:r>
+      <w:r>
+        <w:rPr>
+          <w:rFonts w:ascii="Consolas" w:eastAsia="Times New Roman" w:hAnsi="Consolas" w:cs="Times New Roman"/>
+          <w:color w:val="0000FF"/>
+          <w:kern w:val="0"/>
+          <w:sz w:val="21"/>
+          <w:szCs w:val="21"/>
+          <w14:ligatures w14:val="none"/>
+        </w:rPr>
+        <w:t>public</w:t>
+      </w:r>
+      <w:r>
+        <w:rPr>
+          <w:rFonts w:ascii="Consolas" w:eastAsia="Times New Roman" w:hAnsi="Consolas" w:cs="Times New Roman"/>
+          <w:color w:val="000000"/>
+          <w:kern w:val="0"/>
+          <w:sz w:val="21"/>
+          <w:szCs w:val="21"/>
+          <w14:ligatures w14:val="none"/>
+        </w:rPr>
+        <w:t xml:space="preserve"> </w:t>
+      </w:r>
+      <w:r>
+        <w:rPr>
+          <w:rFonts w:ascii="Consolas" w:eastAsia="Times New Roman" w:hAnsi="Consolas" w:cs="Times New Roman"/>
+          <w:color w:val="0000FF"/>
+          <w:kern w:val="0"/>
+          <w:sz w:val="21"/>
+          <w:szCs w:val="21"/>
+          <w14:ligatures w14:val="none"/>
+        </w:rPr>
+        <w:t>function</w:t>
+      </w:r>
+      <w:r>
+        <w:rPr>
+          <w:rFonts w:ascii="Consolas" w:eastAsia="Times New Roman" w:hAnsi="Consolas" w:cs="Times New Roman"/>
+          <w:color w:val="000000"/>
+          <w:kern w:val="0"/>
+          <w:sz w:val="21"/>
+          <w:szCs w:val="21"/>
+          <w14:ligatures w14:val="none"/>
+        </w:rPr>
+        <w:t xml:space="preserve"> </w:t>
+      </w:r>
+      <w:proofErr w:type="gramStart"/>
+      <w:r>
+        <w:rPr>
+          <w:rFonts w:ascii="Consolas" w:eastAsia="Times New Roman" w:hAnsi="Consolas" w:cs="Times New Roman"/>
+          <w:color w:val="795E26"/>
+          <w:kern w:val="0"/>
+          <w:sz w:val="21"/>
+          <w:szCs w:val="21"/>
+          <w14:ligatures w14:val="none"/>
+        </w:rPr>
+        <w:t>scopeOfType</w:t>
+      </w:r>
+      <w:r>
+        <w:rPr>
+          <w:rFonts w:ascii="Consolas" w:eastAsia="Times New Roman" w:hAnsi="Consolas" w:cs="Times New Roman"/>
+          <w:color w:val="000000"/>
+          <w:kern w:val="0"/>
+          <w:sz w:val="21"/>
+          <w:szCs w:val="21"/>
+          <w14:ligatures w14:val="none"/>
+        </w:rPr>
+        <w:t>(</w:t>
+      </w:r>
+      <w:proofErr w:type="gramEnd"/>
+      <w:r>
+        <w:rPr>
+          <w:rFonts w:ascii="Consolas" w:eastAsia="Times New Roman" w:hAnsi="Consolas" w:cs="Times New Roman"/>
+          <w:color w:val="0000FF"/>
+          <w:kern w:val="0"/>
+          <w:sz w:val="21"/>
+          <w:szCs w:val="21"/>
+          <w14:ligatures w14:val="none"/>
+        </w:rPr>
+        <w:t>mixed</w:t>
+      </w:r>
+      <w:r>
+        <w:rPr>
+          <w:rFonts w:ascii="Consolas" w:eastAsia="Times New Roman" w:hAnsi="Consolas" w:cs="Times New Roman"/>
+          <w:color w:val="000000"/>
+          <w:kern w:val="0"/>
+          <w:sz w:val="21"/>
+          <w:szCs w:val="21"/>
+          <w14:ligatures w14:val="none"/>
+        </w:rPr>
+        <w:t xml:space="preserve"> </w:t>
+      </w:r>
+      <w:r>
+        <w:rPr>
+          <w:rFonts w:ascii="Consolas" w:eastAsia="Times New Roman" w:hAnsi="Consolas" w:cs="Times New Roman"/>
+          <w:color w:val="001080"/>
+          <w:kern w:val="0"/>
+          <w:sz w:val="21"/>
+          <w:szCs w:val="21"/>
+          <w14:ligatures w14:val="none"/>
+        </w:rPr>
+        <w:t>$query</w:t>
+      </w:r>
+      <w:r>
+        <w:rPr>
+          <w:rFonts w:ascii="Consolas" w:eastAsia="Times New Roman" w:hAnsi="Consolas" w:cs="Times New Roman"/>
+          <w:color w:val="000000"/>
+          <w:kern w:val="0"/>
+          <w:sz w:val="21"/>
+          <w:szCs w:val="21"/>
+          <w14:ligatures w14:val="none"/>
+        </w:rPr>
+        <w:t xml:space="preserve">, </w:t>
+      </w:r>
+      <w:r>
+        <w:rPr>
+          <w:rFonts w:ascii="Consolas" w:eastAsia="Times New Roman" w:hAnsi="Consolas" w:cs="Times New Roman"/>
+          <w:color w:val="0000FF"/>
+          <w:kern w:val="0"/>
+          <w:sz w:val="21"/>
+          <w:szCs w:val="21"/>
+          <w14:ligatures w14:val="none"/>
+        </w:rPr>
+        <w:t>string</w:t>
+      </w:r>
+      <w:r>
+        <w:rPr>
+          <w:rFonts w:ascii="Consolas" w:eastAsia="Times New Roman" w:hAnsi="Consolas" w:cs="Times New Roman"/>
+          <w:color w:val="000000"/>
+          <w:kern w:val="0"/>
+          <w:sz w:val="21"/>
+          <w:szCs w:val="21"/>
+          <w14:ligatures w14:val="none"/>
+        </w:rPr>
+        <w:t xml:space="preserve"> </w:t>
+      </w:r>
+      <w:r>
+        <w:rPr>
+          <w:rFonts w:ascii="Consolas" w:eastAsia="Times New Roman" w:hAnsi="Consolas" w:cs="Times New Roman"/>
+          <w:color w:val="001080"/>
+          <w:kern w:val="0"/>
+          <w:sz w:val="21"/>
+          <w:szCs w:val="21"/>
+          <w14:ligatures w14:val="none"/>
+        </w:rPr>
+        <w:t>$type</w:t>
+      </w:r>
+      <w:r>
+        <w:rPr>
+          <w:rFonts w:ascii="Consolas" w:eastAsia="Times New Roman" w:hAnsi="Consolas" w:cs="Times New Roman"/>
+          <w:color w:val="000000"/>
+          <w:kern w:val="0"/>
+          <w:sz w:val="21"/>
+          <w:szCs w:val="21"/>
+          <w14:ligatures w14:val="none"/>
+        </w:rPr>
+        <w:t xml:space="preserve">): </w:t>
+      </w:r>
+      <w:r>
+        <w:rPr>
+          <w:rFonts w:ascii="Consolas" w:eastAsia="Times New Roman" w:hAnsi="Consolas" w:cs="Times New Roman"/>
+          <w:color w:val="0000FF"/>
+          <w:kern w:val="0"/>
+          <w:sz w:val="21"/>
+          <w:szCs w:val="21"/>
+          <w14:ligatures w14:val="none"/>
+        </w:rPr>
+        <w:t>mixed</w:t>
+      </w:r>
+    </w:p>
+    <w:p>
+      <w:pPr>
+        <w:shd w:val="clear" w:color="auto" w:fill="FFFFFF"/>
+        <w:spacing w:after="0" w:line="285" w:lineRule="atLeast"/>
+        <w:rPr>
+          <w:rFonts w:ascii="Consolas" w:eastAsia="Times New Roman" w:hAnsi="Consolas" w:cs="Times New Roman"/>
+          <w:color w:val="3B3B3B"/>
+          <w:kern w:val="0"/>
+          <w:sz w:val="21"/>
+          <w:szCs w:val="21"/>
+          <w14:ligatures w14:val="none"/>
+        </w:rPr>
+      </w:pPr>
+      <w:r>
+        <w:rPr>
+          <w:rFonts w:ascii="Consolas" w:eastAsia="Times New Roman" w:hAnsi="Consolas" w:cs="Times New Roman"/>
+          <w:color w:val="000000"/>
+          <w:kern w:val="0"/>
+          <w:sz w:val="21"/>
+          <w:szCs w:val="21"/>
+          <w14:ligatures w14:val="none"/>
+        </w:rPr>
+        <w:t>    {</w:t>
+      </w:r>
+    </w:p>
+    <w:p>
+      <w:pPr>
+        <w:shd w:val="clear" w:color="auto" w:fill="FFFFFF"/>
+        <w:spacing w:after="0" w:line="285" w:lineRule="atLeast"/>
+        <w:rPr>
+          <w:rFonts w:ascii="Consolas" w:eastAsia="Times New Roman" w:hAnsi="Consolas" w:cs="Times New Roman"/>
+          <w:color w:val="3B3B3B"/>
+          <w:kern w:val="0"/>
+          <w:sz w:val="21"/>
+          <w:szCs w:val="21"/>
+          <w14:ligatures w14:val="none"/>
+        </w:rPr>
+      </w:pPr>
+      <w:r>
+        <w:rPr>
+          <w:rFonts w:ascii="Consolas" w:eastAsia="Times New Roman" w:hAnsi="Consolas" w:cs="Times New Roman"/>
+          <w:color w:val="000000"/>
+          <w:kern w:val="0"/>
+          <w:sz w:val="21"/>
+          <w:szCs w:val="21"/>
+          <w14:ligatures w14:val="none"/>
+        </w:rPr>
+        <w:t xml:space="preserve">        </w:t>
+      </w:r>
+      <w:r>
+        <w:rPr>
+          <w:rFonts w:ascii="Consolas" w:eastAsia="Times New Roman" w:hAnsi="Consolas" w:cs="Times New Roman"/>
+          <w:color w:val="AF00DB"/>
+          <w:kern w:val="0"/>
+          <w:sz w:val="21"/>
+          <w:szCs w:val="21"/>
+          <w14:ligatures w14:val="none"/>
+        </w:rPr>
+        <w:t>return</w:t>
+      </w:r>
+      <w:r>
+        <w:rPr>
+          <w:rFonts w:ascii="Consolas" w:eastAsia="Times New Roman" w:hAnsi="Consolas" w:cs="Times New Roman"/>
+          <w:color w:val="000000"/>
+          <w:kern w:val="0"/>
+          <w:sz w:val="21"/>
+          <w:szCs w:val="21"/>
+          <w14:ligatures w14:val="none"/>
+        </w:rPr>
+        <w:t xml:space="preserve"> </w:t>
+      </w:r>
+      <w:r>
+        <w:rPr>
+          <w:rFonts w:ascii="Consolas" w:eastAsia="Times New Roman" w:hAnsi="Consolas" w:cs="Times New Roman"/>
+          <w:color w:val="001080"/>
+          <w:kern w:val="0"/>
+          <w:sz w:val="21"/>
+          <w:szCs w:val="21"/>
+          <w14:ligatures w14:val="none"/>
+        </w:rPr>
+        <w:t>$query</w:t>
+      </w:r>
+    </w:p>
+    <w:p>
+      <w:pPr>
+        <w:shd w:val="clear" w:color="auto" w:fill="FFFFFF"/>
+        <w:spacing w:after="0" w:line="285" w:lineRule="atLeast"/>
+        <w:rPr>
+          <w:rFonts w:ascii="Consolas" w:eastAsia="Times New Roman" w:hAnsi="Consolas" w:cs="Times New Roman"/>
+          <w:color w:val="3B3B3B"/>
+          <w:kern w:val="0"/>
+          <w:sz w:val="21"/>
+          <w:szCs w:val="21"/>
+          <w14:ligatures w14:val="none"/>
+        </w:rPr>
+      </w:pPr>
+      <w:r>
+        <w:rPr>
+          <w:rFonts w:ascii="Consolas" w:eastAsia="Times New Roman" w:hAnsi="Consolas" w:cs="Times New Roman"/>
+          <w:color w:val="000000"/>
+          <w:kern w:val="0"/>
+          <w:sz w:val="21"/>
+          <w:szCs w:val="21"/>
+          <w14:ligatures w14:val="none"/>
+        </w:rPr>
+        <w:t>            -&gt;</w:t>
+      </w:r>
+      <w:proofErr w:type="gramStart"/>
+      <w:r>
+        <w:rPr>
+          <w:rFonts w:ascii="Consolas" w:eastAsia="Times New Roman" w:hAnsi="Consolas" w:cs="Times New Roman"/>
+          <w:color w:val="795E26"/>
+          <w:kern w:val="0"/>
+          <w:sz w:val="21"/>
+          <w:szCs w:val="21"/>
+          <w14:ligatures w14:val="none"/>
+        </w:rPr>
+        <w:t>where</w:t>
+      </w:r>
+      <w:r>
+        <w:rPr>
+          <w:rFonts w:ascii="Consolas" w:eastAsia="Times New Roman" w:hAnsi="Consolas" w:cs="Times New Roman"/>
+          <w:color w:val="000000"/>
+          <w:kern w:val="0"/>
+          <w:sz w:val="21"/>
+          <w:szCs w:val="21"/>
+          <w14:ligatures w14:val="none"/>
+        </w:rPr>
+        <w:t>(</w:t>
+      </w:r>
+      <w:proofErr w:type="gramEnd"/>
+      <w:r>
+        <w:rPr>
+          <w:rFonts w:ascii="Consolas" w:eastAsia="Times New Roman" w:hAnsi="Consolas" w:cs="Times New Roman"/>
+          <w:color w:val="A31515"/>
+          <w:kern w:val="0"/>
+          <w:sz w:val="21"/>
+          <w:szCs w:val="21"/>
+          <w14:ligatures w14:val="none"/>
+        </w:rPr>
+        <w:t>'type'</w:t>
+      </w:r>
+      <w:r>
+        <w:rPr>
+          <w:rFonts w:ascii="Consolas" w:eastAsia="Times New Roman" w:hAnsi="Consolas" w:cs="Times New Roman"/>
+          <w:color w:val="000000"/>
+          <w:kern w:val="0"/>
+          <w:sz w:val="21"/>
+          <w:szCs w:val="21"/>
+          <w14:ligatures w14:val="none"/>
+        </w:rPr>
+        <w:t xml:space="preserve">, </w:t>
+      </w:r>
+      <w:r>
+        <w:rPr>
+          <w:rFonts w:ascii="Consolas" w:eastAsia="Times New Roman" w:hAnsi="Consolas" w:cs="Times New Roman"/>
+          <w:color w:val="001080"/>
+          <w:kern w:val="0"/>
+          <w:sz w:val="21"/>
+          <w:szCs w:val="21"/>
+          <w14:ligatures w14:val="none"/>
+        </w:rPr>
+        <w:t>$type</w:t>
+      </w:r>
+      <w:r>
+        <w:rPr>
+          <w:rFonts w:ascii="Consolas" w:eastAsia="Times New Roman" w:hAnsi="Consolas" w:cs="Times New Roman"/>
+          <w:color w:val="000000"/>
+          <w:kern w:val="0"/>
+          <w:sz w:val="21"/>
+          <w:szCs w:val="21"/>
+          <w14:ligatures w14:val="none"/>
+        </w:rPr>
+        <w:t>)</w:t>
+      </w:r>
+    </w:p>
+    <w:p>
+      <w:pPr>
+        <w:shd w:val="clear" w:color="auto" w:fill="FFFFFF"/>
+        <w:spacing w:after="0" w:line="285" w:lineRule="atLeast"/>
+        <w:rPr>
+          <w:rFonts w:ascii="Consolas" w:eastAsia="Times New Roman" w:hAnsi="Consolas" w:cs="Times New Roman"/>
+          <w:color w:val="3B3B3B"/>
+          <w:kern w:val="0"/>
+          <w:sz w:val="21"/>
+          <w:szCs w:val="21"/>
+          <w14:ligatures w14:val="none"/>
+        </w:rPr>
+      </w:pPr>
+      <w:r>
+        <w:rPr>
+          <w:rFonts w:ascii="Consolas" w:eastAsia="Times New Roman" w:hAnsi="Consolas" w:cs="Times New Roman"/>
+          <w:color w:val="000000"/>
+          <w:kern w:val="0"/>
+          <w:sz w:val="21"/>
+          <w:szCs w:val="21"/>
+          <w14:ligatures w14:val="none"/>
+        </w:rPr>
+        <w:t xml:space="preserve">            </w:t>
+      </w:r>
+      <w:r>
+        <w:rPr>
+          <w:rFonts w:ascii="Consolas" w:eastAsia="Times New Roman" w:hAnsi="Consolas" w:cs="Times New Roman"/>
+          <w:color w:val="008000"/>
+          <w:kern w:val="0"/>
+          <w:sz w:val="21"/>
+          <w:szCs w:val="21"/>
+          <w14:ligatures w14:val="none"/>
+        </w:rPr>
+        <w:t>// -&gt;</w:t>
+      </w:r>
+      <w:proofErr w:type="gramStart"/>
+      <w:r>
+        <w:rPr>
+          <w:rFonts w:ascii="Consolas" w:eastAsia="Times New Roman" w:hAnsi="Consolas" w:cs="Times New Roman"/>
+          <w:color w:val="008000"/>
+          <w:kern w:val="0"/>
+          <w:sz w:val="21"/>
+          <w:szCs w:val="21"/>
+          <w14:ligatures w14:val="none"/>
+        </w:rPr>
+        <w:t>where(</w:t>
+      </w:r>
+      <w:proofErr w:type="gramEnd"/>
+      <w:r>
+        <w:rPr>
+          <w:rFonts w:ascii="Consolas" w:eastAsia="Times New Roman" w:hAnsi="Consolas" w:cs="Times New Roman"/>
+          <w:color w:val="008000"/>
+          <w:kern w:val="0"/>
+          <w:sz w:val="21"/>
+          <w:szCs w:val="21"/>
+          <w14:ligatures w14:val="none"/>
+        </w:rPr>
+        <w:t>'description', 'LIKE', '%something%')</w:t>
+      </w:r>
+    </w:p>
+    <w:p>
+      <w:pPr>
+        <w:shd w:val="clear" w:color="auto" w:fill="FFFFFF"/>
+        <w:spacing w:after="0" w:line="285" w:lineRule="atLeast"/>
+        <w:rPr>
+          <w:rFonts w:ascii="Consolas" w:eastAsia="Times New Roman" w:hAnsi="Consolas" w:cs="Times New Roman"/>
+          <w:color w:val="3B3B3B"/>
+          <w:kern w:val="0"/>
+          <w:sz w:val="21"/>
+          <w:szCs w:val="21"/>
+          <w14:ligatures w14:val="none"/>
+        </w:rPr>
+      </w:pPr>
+      <w:r>
+        <w:rPr>
+          <w:rFonts w:ascii="Consolas" w:eastAsia="Times New Roman" w:hAnsi="Consolas" w:cs="Times New Roman"/>
+          <w:color w:val="000000"/>
+          <w:kern w:val="0"/>
+          <w:sz w:val="21"/>
+          <w:szCs w:val="21"/>
+          <w14:ligatures w14:val="none"/>
+        </w:rPr>
+        <w:t>            -&gt;</w:t>
+      </w:r>
+      <w:proofErr w:type="gramStart"/>
+      <w:r>
+        <w:rPr>
+          <w:rFonts w:ascii="Consolas" w:eastAsia="Times New Roman" w:hAnsi="Consolas" w:cs="Times New Roman"/>
+          <w:color w:val="795E26"/>
+          <w:kern w:val="0"/>
+          <w:sz w:val="21"/>
+          <w:szCs w:val="21"/>
+          <w14:ligatures w14:val="none"/>
+        </w:rPr>
+        <w:t>whereFullText</w:t>
+      </w:r>
+      <w:r>
+        <w:rPr>
+          <w:rFonts w:ascii="Consolas" w:eastAsia="Times New Roman" w:hAnsi="Consolas" w:cs="Times New Roman"/>
+          <w:color w:val="000000"/>
+          <w:kern w:val="0"/>
+          <w:sz w:val="21"/>
+          <w:szCs w:val="21"/>
+          <w14:ligatures w14:val="none"/>
+        </w:rPr>
+        <w:t>(</w:t>
+      </w:r>
+      <w:proofErr w:type="gramEnd"/>
+      <w:r>
+        <w:rPr>
+          <w:rFonts w:ascii="Consolas" w:eastAsia="Times New Roman" w:hAnsi="Consolas" w:cs="Times New Roman"/>
+          <w:color w:val="A31515"/>
+          <w:kern w:val="0"/>
+          <w:sz w:val="21"/>
+          <w:szCs w:val="21"/>
+          <w14:ligatures w14:val="none"/>
+        </w:rPr>
+        <w:t>'description'</w:t>
+      </w:r>
+      <w:r>
+        <w:rPr>
+          <w:rFonts w:ascii="Consolas" w:eastAsia="Times New Roman" w:hAnsi="Consolas" w:cs="Times New Roman"/>
+          <w:color w:val="000000"/>
+          <w:kern w:val="0"/>
+          <w:sz w:val="21"/>
+          <w:szCs w:val="21"/>
+          <w14:ligatures w14:val="none"/>
+        </w:rPr>
+        <w:t xml:space="preserve">, </w:t>
+      </w:r>
+      <w:r>
+        <w:rPr>
+          <w:rFonts w:ascii="Consolas" w:eastAsia="Times New Roman" w:hAnsi="Consolas" w:cs="Times New Roman"/>
+          <w:color w:val="A31515"/>
+          <w:kern w:val="0"/>
+          <w:sz w:val="21"/>
+          <w:szCs w:val="21"/>
+          <w14:ligatures w14:val="none"/>
+        </w:rPr>
+        <w:t>'something other'</w:t>
+      </w:r>
+      <w:r>
+        <w:rPr>
+          <w:rFonts w:ascii="Consolas" w:eastAsia="Times New Roman" w:hAnsi="Consolas" w:cs="Times New Roman"/>
+          <w:color w:val="000000"/>
+          <w:kern w:val="0"/>
+          <w:sz w:val="21"/>
+          <w:szCs w:val="21"/>
+          <w14:ligatures w14:val="none"/>
+        </w:rPr>
+        <w:t>)</w:t>
+      </w:r>
+    </w:p>
+    <w:p>
+      <w:pPr>
+        <w:shd w:val="clear" w:color="auto" w:fill="FFFFFF"/>
+        <w:spacing w:after="0" w:line="285" w:lineRule="atLeast"/>
+        <w:rPr>
+          <w:rFonts w:ascii="Consolas" w:eastAsia="Times New Roman" w:hAnsi="Consolas" w:cs="Times New Roman"/>
+          <w:color w:val="3B3B3B"/>
+          <w:kern w:val="0"/>
+          <w:sz w:val="21"/>
+          <w:szCs w:val="21"/>
+          <w14:ligatures w14:val="none"/>
+        </w:rPr>
+      </w:pPr>
+      <w:r>
+        <w:rPr>
+          <w:rFonts w:ascii="Consolas" w:eastAsia="Times New Roman" w:hAnsi="Consolas" w:cs="Times New Roman"/>
+          <w:color w:val="000000"/>
+          <w:kern w:val="0"/>
+          <w:sz w:val="21"/>
+          <w:szCs w:val="21"/>
+          <w14:ligatures w14:val="none"/>
+        </w:rPr>
+        <w:t>            -&gt;</w:t>
+      </w:r>
+      <w:r>
+        <w:rPr>
+          <w:rFonts w:ascii="Consolas" w:eastAsia="Times New Roman" w:hAnsi="Consolas" w:cs="Times New Roman"/>
+          <w:color w:val="795E26"/>
+          <w:kern w:val="0"/>
+          <w:sz w:val="21"/>
+          <w:szCs w:val="21"/>
+          <w14:ligatures w14:val="none"/>
+        </w:rPr>
+        <w:t>orderBy</w:t>
+      </w:r>
+      <w:r>
+        <w:rPr>
+          <w:rFonts w:ascii="Consolas" w:eastAsia="Times New Roman" w:hAnsi="Consolas" w:cs="Times New Roman"/>
+          <w:color w:val="000000"/>
+          <w:kern w:val="0"/>
+          <w:sz w:val="21"/>
+          <w:szCs w:val="21"/>
+          <w14:ligatures w14:val="none"/>
+        </w:rPr>
+        <w:t>(</w:t>
+      </w:r>
+      <w:r>
+        <w:rPr>
+          <w:rFonts w:ascii="Consolas" w:eastAsia="Times New Roman" w:hAnsi="Consolas" w:cs="Times New Roman"/>
+          <w:color w:val="A31515"/>
+          <w:kern w:val="0"/>
+          <w:sz w:val="21"/>
+          <w:szCs w:val="21"/>
+          <w14:ligatures w14:val="none"/>
+        </w:rPr>
+        <w:t>'date'</w:t>
+      </w:r>
+      <w:r>
+        <w:rPr>
+          <w:rFonts w:ascii="Consolas" w:eastAsia="Times New Roman" w:hAnsi="Consolas" w:cs="Times New Roman"/>
+          <w:color w:val="000000"/>
+          <w:kern w:val="0"/>
+          <w:sz w:val="21"/>
+          <w:szCs w:val="21"/>
+          <w14:ligatures w14:val="none"/>
+        </w:rPr>
+        <w:t>)</w:t>
+      </w:r>
+    </w:p>
+    <w:p>
+      <w:pPr>
+        <w:shd w:val="clear" w:color="auto" w:fill="FFFFFF"/>
+        <w:spacing w:after="0" w:line="285" w:lineRule="atLeast"/>
+        <w:rPr>
+          <w:rFonts w:ascii="Consolas" w:eastAsia="Times New Roman" w:hAnsi="Consolas" w:cs="Times New Roman"/>
+          <w:color w:val="3B3B3B"/>
+          <w:kern w:val="0"/>
+          <w:sz w:val="21"/>
+          <w:szCs w:val="21"/>
+          <w14:ligatures w14:val="none"/>
+        </w:rPr>
+      </w:pPr>
+      <w:r>
+        <w:rPr>
+          <w:rFonts w:ascii="Consolas" w:eastAsia="Times New Roman" w:hAnsi="Consolas" w:cs="Times New Roman"/>
+          <w:color w:val="000000"/>
+          <w:kern w:val="0"/>
+          <w:sz w:val="21"/>
+          <w:szCs w:val="21"/>
+          <w14:ligatures w14:val="none"/>
+        </w:rPr>
+        <w:t>            -&gt;</w:t>
+      </w:r>
+      <w:proofErr w:type="gramStart"/>
+      <w:r>
+        <w:rPr>
+          <w:rFonts w:ascii="Consolas" w:eastAsia="Times New Roman" w:hAnsi="Consolas" w:cs="Times New Roman"/>
+          <w:color w:val="795E26"/>
+          <w:kern w:val="0"/>
+          <w:sz w:val="21"/>
+          <w:szCs w:val="21"/>
+          <w14:ligatures w14:val="none"/>
+        </w:rPr>
+        <w:t>limit</w:t>
+      </w:r>
+      <w:r>
+        <w:rPr>
+          <w:rFonts w:ascii="Consolas" w:eastAsia="Times New Roman" w:hAnsi="Consolas" w:cs="Times New Roman"/>
+          <w:color w:val="000000"/>
+          <w:kern w:val="0"/>
+          <w:sz w:val="21"/>
+          <w:szCs w:val="21"/>
+          <w14:ligatures w14:val="none"/>
+        </w:rPr>
+        <w:t>(</w:t>
+      </w:r>
+      <w:proofErr w:type="gramEnd"/>
+      <w:r>
+        <w:rPr>
+          <w:rFonts w:ascii="Consolas" w:eastAsia="Times New Roman" w:hAnsi="Consolas" w:cs="Times New Roman"/>
+          <w:color w:val="098658"/>
+          <w:kern w:val="0"/>
+          <w:sz w:val="21"/>
+          <w:szCs w:val="21"/>
+          <w14:ligatures w14:val="none"/>
+        </w:rPr>
+        <w:t>5</w:t>
+      </w:r>
+      <w:r>
+        <w:rPr>
+          <w:rFonts w:ascii="Consolas" w:eastAsia="Times New Roman" w:hAnsi="Consolas" w:cs="Times New Roman"/>
+          <w:color w:val="000000"/>
+          <w:kern w:val="0"/>
+          <w:sz w:val="21"/>
+          <w:szCs w:val="21"/>
+          <w14:ligatures w14:val="none"/>
+        </w:rPr>
+        <w:t>);</w:t>
+      </w:r>
+    </w:p>
+    <w:p>
+      <w:pPr>
+        <w:shd w:val="clear" w:color="auto" w:fill="FFFFFF"/>
+        <w:spacing w:after="0" w:line="285" w:lineRule="atLeast"/>
+        <w:rPr>
+          <w:rFonts w:ascii="Consolas" w:eastAsia="Times New Roman" w:hAnsi="Consolas" w:cs="Times New Roman"/>
+          <w:color w:val="3B3B3B"/>
+          <w:kern w:val="0"/>
+          <w:sz w:val="21"/>
+          <w:szCs w:val="21"/>
+          <w14:ligatures w14:val="none"/>
+        </w:rPr>
+      </w:pPr>
+      <w:r>
+        <w:rPr>
+          <w:rFonts w:ascii="Consolas" w:eastAsia="Times New Roman" w:hAnsi="Consolas" w:cs="Times New Roman"/>
+          <w:color w:val="000000"/>
+          <w:kern w:val="0"/>
+          <w:sz w:val="21"/>
+          <w:szCs w:val="21"/>
+          <w14:ligatures w14:val="none"/>
+        </w:rPr>
+        <w:t>    }</w:t>
+      </w:r>
+    </w:p>
+    <w:p>
+      <w:pPr>
+        <w:shd w:val="clear" w:color="auto" w:fill="FFFFFF"/>
+        <w:spacing w:after="0" w:line="285" w:lineRule="atLeast"/>
+        <w:rPr>
+          <w:rFonts w:ascii="Consolas" w:eastAsia="Times New Roman" w:hAnsi="Consolas" w:cs="Times New Roman"/>
+          <w:color w:val="3B3B3B"/>
+          <w:kern w:val="0"/>
+          <w:sz w:val="21"/>
+          <w:szCs w:val="21"/>
+          <w14:ligatures w14:val="none"/>
+        </w:rPr>
+      </w:pPr>
+      <w:r>
+        <w:rPr>
+          <w:rFonts w:ascii="Consolas" w:eastAsia="Times New Roman" w:hAnsi="Consolas" w:cs="Times New Roman"/>
+          <w:color w:val="000000"/>
+          <w:kern w:val="0"/>
+          <w:sz w:val="21"/>
+          <w:szCs w:val="21"/>
+          <w14:ligatures w14:val="none"/>
+        </w:rPr>
+        <w:t>}</w:t>
+      </w:r>
+    </w:p>
+    <w:p>
+      <w:pPr>
+        <w:ind w:left="720" w:firstLine="720"/>
+      </w:pPr>
+      <w:r>
+        <w:t>=====================================================</w:t>
+      </w:r>
+    </w:p>
+    <w:p>
+      <w:pPr>
+        <w:shd w:val="clear" w:color="auto" w:fill="FFFFFF"/>
+        <w:spacing w:after="0" w:line="285" w:lineRule="atLeast"/>
+        <w:rPr>
+          <w:rFonts w:ascii="Sakkal Majalla" w:eastAsia="Times New Roman" w:hAnsi="Sakkal Majalla" w:cs="Sakkal Majalla"/>
+          <w:color w:val="3B3B3B"/>
+          <w:kern w:val="0"/>
+          <w:sz w:val="28"/>
+          <w:szCs w:val="28"/>
+          <w14:ligatures w14:val="none"/>
+        </w:rPr>
+      </w:pPr>
+    </w:p>
+    <w:p>
+      <w:pPr>
+        <w:rPr>
+          <w:rFonts w:ascii="Sakkal Majalla" w:hAnsi="Sakkal Majalla" w:cs="Sakkal Majalla"/>
+          <w:sz w:val="28"/>
+          <w:szCs w:val="28"/>
+        </w:rPr>
+      </w:pPr>
     </w:p>
     <w:sectPr>
       <w:pgSz w:w="12240" w:h="15840"/>
@@ -2686,6 +4278,7 @@
   <w:style w:type="paragraph" w:default="1" w:styleId="Normal">
     <w:name w:val="Normal"/>
     <w:qFormat/>
+    <w:rsid w:val="00F90F37"/>
   </w:style>
   <w:style w:type="paragraph" w:styleId="Heading1">
     <w:name w:val="heading 1"/>

</xml_diff>